<commit_message>
docs: align repo metadata, design docs, and mockups with Passport UI
- add MIT LICENSE and .gitattributes (bat=CRLF, code=LF, binaries)
- publish.bat: note LatoFont folder must ship beside the exe
- PRD: .NET 10 -> .NET 9, Inter/Segoe UI -> Courier Prime
- Detail_Desain_UIUX: regenerate rev.2 (teal/SISMA palette and MDL2
  icon text replaced by light/dark token tables with swatches and
  8 fresh in-app screenshots)
- docs/assets: recapture all screenshots from restyled app, both
  themes, no tooltips/mid-animation frames

Co-Authored-By: Claude Code <noreply@anthropic.com>
</commit_message>
<xml_diff>
--- a/docs/PRD_PerpusKu.docx
+++ b/docs/PRD_PerpusKu.docx
@@ -358,7 +358,7 @@
                 <w:sz w:val="20"/>
                 <w:szCs w:val="20"/>
               </w:rPr>
-              <w:t xml:space="preserve">Aplikasi desktop Windows (WPF, .NET 10)</w:t>
+              <w:t>Aplikasi desktop Windows (WPF, .NET 9)</w:t>
             </w:r>
           </w:p>
         </w:tc>
@@ -7942,7 +7942,7 @@
                 <w:sz w:val="20"/>
                 <w:szCs w:val="20"/>
               </w:rPr>
-              <w:t xml:space="preserve">C# dan XAML pada WPF (.NET 10, LTS) untuk desktop Windows yang kaya UI.</w:t>
+              <w:t>C# dan XAML pada WPF (.NET 9, LTS) untuk desktop Windows yang kaya UI.</w:t>
             </w:r>
           </w:p>
         </w:tc>
@@ -12196,7 +12196,7 @@
                 <w:sz w:val="20"/>
                 <w:szCs w:val="20"/>
               </w:rPr>
-              <w:t xml:space="preserve">Inter.</w:t>
+              <w:t>Courier Prime.</w:t>
             </w:r>
           </w:p>
         </w:tc>
@@ -12227,7 +12227,7 @@
                 <w:sz w:val="20"/>
                 <w:szCs w:val="20"/>
               </w:rPr>
-              <w:t xml:space="preserve">Serif untuk judul, Segoe UI untuk isi.</w:t>
+              <w:t>Monospace Courier Prime untuk judul dan isi, gaya mesin tik.</w:t>
             </w:r>
           </w:p>
         </w:tc>

</xml_diff>